<commit_message>
Concept Profile: the rubric asks for the question the body describes; three to five samples
The rubric's example questions asked what intervention works (applet features,
routines) and called for a 'measurable' question — the opposite of the open,
how-do-students-understand question the body text and Week 7 ask for. The
examples are now that kind of question.

The Profile asked for two or three work samples; Week 7 grades three to five
with no field visit in between. The Profile now asks for three to five.

Co-Authored-By: Claude Opus 5 (1M context) <noreply@anthropic.com>
</commit_message>
<xml_diff>
--- a/week-6-field-dip/week-6-concept-profile.docx
+++ b/week-6-field-dip/week-6-concept-profile.docx
@@ -257,7 +257,7 @@
           <w:sz w:val="22"/>
           <w:szCs w:val="22"/>
         </w:rPr>
-        <w:t xml:space="preserve"> Gather two or three pieces of actual student mathematics work on this concept from your field days. De-identify every piece (remove the name; a pseudonym or nothing). This is your first evidence of how students currently understand the concept.</w:t>
+        <w:t xml:space="preserve"> Gather three to five pieces of actual student mathematics work on this concept from your field days. De-identify every piece (remove the name; a pseudonym or nothing). This is your first evidence of how students currently understand the concept.</w:t>
       </w:r>
     </w:p>
     <w:p>
@@ -335,7 +335,7 @@
           <w:sz w:val="22"/>
           <w:szCs w:val="22"/>
         </w:rPr>
-        <w:t>One to two pages, typed, single-spaced, 12pt — plus the two or three collected work samples attached.</w:t>
+        <w:t>One to two pages, typed, single-spaced, 12pt — plus the three to five collected work samples attached.</w:t>
       </w:r>
     </w:p>
     <w:p>
@@ -666,7 +666,7 @@
                 <w:sz w:val="22"/>
                 <w:szCs w:val="22"/>
               </w:rPr>
-              <w:t>Your question: A researchable, measurable question about how students understand this concept, understood in one sentence. For instance:</w:t>
+              <w:t>Your question: A first read, in one sentence — an open question about how students understand this concept, not whether they got it right, and not a diagnosis of a child. For instance:</w:t>
             </w:r>
           </w:p>
           <w:p>
@@ -679,7 +679,7 @@
                 <w:sz w:val="22"/>
                 <w:szCs w:val="22"/>
               </w:rPr>
-              <w:t>What web applet features help students better understand multiplication?</w:t>
+              <w:t>How do students reason about equal shares of a set?</w:t>
             </w:r>
           </w:p>
           <w:p>
@@ -692,7 +692,7 @@
                 <w:sz w:val="22"/>
                 <w:szCs w:val="22"/>
               </w:rPr>
-              <w:t>What math routines help students articulate their own thinking about percentages?</w:t>
+              <w:t>What do students attend to when they decide two different solution methods are equivalent?</w:t>
             </w:r>
           </w:p>
         </w:tc>
@@ -756,7 +756,7 @@
                 <w:sz w:val="22"/>
                 <w:szCs w:val="22"/>
               </w:rPr>
-              <w:t>Two or three pieces of actual student math work on this concept, de-identified, and described so a reader can see what they reveal about how students currently understand it — real evidence, not “I got some work.”</w:t>
+              <w:t>Three to five pieces of actual student math work on this concept, de-identified, and described so a reader can see what they reveal about how students currently understand it — real evidence, not “I got some work.”</w:t>
             </w:r>
           </w:p>
         </w:tc>

</xml_diff>

<commit_message>
Build 65 · Planner in Tools; Concept Profile standards match the app
- Course home: BDA Planner added to the apps list, with a note that the
  Second reads ask for the class passcode the first time.
- Planner: a cancelled or blank passcode now says why nothing happened
  instead of failing silently. 2a asks for at least one content standard
  and one practice, matching the rubric.
- Concept Profile: step 6 and the Standards row ask for the standards
  chosen in Planner 2a; the written paragraph the app never collected is gone.

Co-Authored-By: Claude Opus 5.5 <noreply@anthropic.com>
</commit_message>
<xml_diff>
--- a/week-6-field-dip/week-6-concept-profile.docx
+++ b/week-6-field-dip/week-6-concept-profile.docx
@@ -325,7 +325,7 @@
           <w:sz w:val="22"/>
           <w:szCs w:val="22"/>
         </w:rPr>
-        <w:t xml:space="preserve"> Identify at least one Ohio content standard and one Standard for Mathematical Practice, and say how each relates to your concept and your question.</w:t>
+        <w:t xml:space="preserve"> In the Planner (2a), choose at least one Ohio content standard and one Standard for Mathematical Practice that fit your concept.</w:t>
       </w:r>
     </w:p>
     <w:p>
@@ -985,7 +985,7 @@
                 <w:szCs w:val="22"/>
                 <w:lang w:val="en-US" w:eastAsia="en-US" w:bidi="ar-SA"/>
               </w:rPr>
-              <w:t>At least one accurate, grade-appropriate Ohio content standard and one Standard for Mathematical Practice for the concept, with a brief note (a paragraph) on how the standards relate to your concept and your question.</w:t>
+              <w:t>At least one accurate, grade-appropriate Ohio content standard and one Standard for Mathematical Practice, chosen in the Planner (2a), that fit your concept.</w:t>
             </w:r>
           </w:p>
         </w:tc>

</xml_diff>

<commit_message>
Weeks 6-10: one written policy, separate projects even when teaching the same lesson
Co-Authored-By: Claude Opus 5.5 <noreply@anthropic.com>
</commit_message>
<xml_diff>
--- a/week-6-field-dip/week-6-concept-profile.docx
+++ b/week-6-field-dip/week-6-concept-profile.docx
@@ -238,7 +238,7 @@
           <w:sz w:val="22"/>
           <w:szCs w:val="22"/>
         </w:rPr>
-        <w:t xml:space="preserve"> With your host teacher, identify two or three focus students whose mathematics work on this concept you'll follow. Give each a pseudonym now (e.g., “Jordan”). Real names never leave the classroom. (A research pair co-investigates one concept and shares the same two or three students.)</w:t>
+        <w:t xml:space="preserve"> With your host teacher, identify two or three focus students whose mathematics work on this concept you'll follow. Give each a pseudonym now (e.g., “Jordan”). Real names never leave the classroom.</w:t>
       </w:r>
     </w:p>
     <w:p>
@@ -497,7 +497,7 @@
           <w:sz w:val="22"/>
           <w:szCs w:val="22"/>
         </w:rPr>
-        <w:t>Your concept, your question, and your collected work are the project. Whether you investigate alone or as a research pair. You may connect with your host teacher and compare notes with field partners; if you work as a pair, you co-own one concept, one question, and one shared body of work. The read of the mathematics is yours (or yours together).</w:t>
+        <w:t>Your concept, your question, and your collected work are the project. You may connect with your host teacher and compare notes with classmates. You may teach the same lesson as the classmate you're placed with, but each of you answers your own research question and submits your own work. The read of the mathematics is yours.</w:t>
       </w:r>
     </w:p>
     <w:p>

</xml_diff>